<commit_message>
fix: tesis - caption de Figura C.1 agregado en Anexo C (12 imagenes completas)
</commit_message>
<xml_diff>
--- a/Docs/Devoluciones + archivo de tesis/Tesis_Final_UTNV2 (1).docx
+++ b/Docs/Devoluciones + archivo de tesis/Tesis_Final_UTNV2 (1).docx
@@ -22257,6 +22257,11 @@
           <w:sz w:val="22"/>
         </w:rPr>
         <w:t>.</w:t>
+      </w:r>
+    </w:p>
+    <w:p>
+      <w:r>
+        <w:t>Figura C.1. Documentacion interactiva de la API REST (Swagger UI).</w:t>
       </w:r>
     </w:p>
     <w:p>

</xml_diff>

<commit_message>
feat: tesis - Figura 10 con captura de interaccion del bot en Telegram (13 imagenes)
</commit_message>
<xml_diff>
--- a/Docs/Devoluciones + archivo de tesis/Tesis_Final_UTNV2 (1).docx
+++ b/Docs/Devoluciones + archivo de tesis/Tesis_Final_UTNV2 (1).docx
@@ -10114,6 +10114,47 @@
     <w:p>
       <w:r>
         <w:t>El resultado de estas pruebas confirma que el sistema ejecuta correctamente los flujos de automatización predefinidos en los escenarios cubiertos por las reglas de interpretación. Dado que la lógica de interpretación es determinística y fue definida de manera exhaustiva en la etapa de diseño, la totalidad de los casos correspondientes a las rutas principales y alternativas previstas se completa con éxito, sin errores de ejecución ni respuestas incorrectas.</w:t>
+      </w:r>
+    </w:p>
+    <w:p>
+      <w:r>
+        <w:t>Figura 10. Interacción del bot en Telegram durante las pruebas funcionales.</w:t>
+      </w:r>
+    </w:p>
+    <w:p>
+      <w:r>
+        <w:drawing>
+          <wp:inline xmlns:a="http://schemas.openxmlformats.org/drawingml/2006/main" xmlns:pic="http://schemas.openxmlformats.org/drawingml/2006/picture">
+            <wp:extent cx="3200400" cy="6938537"/>
+            <wp:docPr id="23" name="Picture 23"/>
+            <wp:cNvGraphicFramePr>
+              <a:graphicFrameLocks noChangeAspect="1"/>
+            </wp:cNvGraphicFramePr>
+            <a:graphic>
+              <a:graphicData uri="http://schemas.openxmlformats.org/drawingml/2006/picture">
+                <pic:pic>
+                  <pic:nvPicPr>
+                    <pic:cNvPr id="0" name="Telegram.jpeg"/>
+                    <pic:cNvPicPr/>
+                  </pic:nvPicPr>
+                  <pic:blipFill>
+                    <a:blip r:embed="rId28"/>
+                    <a:stretch>
+                      <a:fillRect/>
+                    </a:stretch>
+                  </pic:blipFill>
+                  <pic:spPr>
+                    <a:xfrm>
+                      <a:off x="0" y="0"/>
+                      <a:ext cx="3200400" cy="6938537"/>
+                    </a:xfrm>
+                    <a:prstGeom prst="rect"/>
+                  </pic:spPr>
+                </pic:pic>
+              </a:graphicData>
+            </a:graphic>
+          </wp:inline>
+        </w:drawing>
       </w:r>
     </w:p>
     <w:p>

</xml_diff>

<commit_message>
fix: tesis - indice de figuras y tablas actualizado (Fig 8-10, B.1, C.1 y Tabla 7 con paginas) y residuo eliminado
</commit_message>
<xml_diff>
--- a/Docs/Devoluciones + archivo de tesis/Tesis_Final_UTNV2 (1).docx
+++ b/Docs/Devoluciones + archivo de tesis/Tesis_Final_UTNV2 (1).docx
@@ -3703,51 +3703,6 @@
     </w:p>
     <w:p>
       <w:pPr>
-        <w:spacing w:before="60" w:after="240"/>
-        <w:jc w:val="center"/>
-      </w:pPr>
-      <w:r>
-        <w:rPr>
-          <w:b/>
-          <w:sz w:val="20"/>
-        </w:rPr>
-        <w:t xml:space="preserve">Figura 8. Panel de </w:t>
-      </w:r>
-      <w:proofErr w:type="spellStart"/>
-      <w:r>
-        <w:rPr>
-          <w:b/>
-          <w:sz w:val="20"/>
-        </w:rPr>
-        <w:t>administracion</w:t>
-      </w:r>
-      <w:proofErr w:type="spellEnd"/>
-      <w:r>
-        <w:rPr>
-          <w:b/>
-          <w:sz w:val="20"/>
-        </w:rPr>
-        <w:t xml:space="preserve"> del sistema (vista de clientes y </w:t>
-      </w:r>
-      <w:proofErr w:type="spellStart"/>
-      <w:r>
-        <w:rPr>
-          <w:b/>
-          <w:sz w:val="20"/>
-        </w:rPr>
-        <w:t>metricas</w:t>
-      </w:r>
-      <w:proofErr w:type="spellEnd"/>
-      <w:r>
-        <w:rPr>
-          <w:b/>
-          <w:sz w:val="20"/>
-        </w:rPr>
-        <w:t>)</w:t>
-      </w:r>
-    </w:p>
-    <w:p>
-      <w:pPr>
         <w:spacing w:before="120" w:after="60"/>
         <w:jc w:val="center"/>
       </w:pPr>
@@ -4465,38 +4420,19 @@
     </w:p>
     <w:p>
       <w:pPr>
-        <w:spacing w:after="200"/>
-      </w:pPr>
-    </w:p>
-    <w:p>
-      <w:pPr>
-        <w:pStyle w:val="Normal"/>
-      </w:pPr>
-      <w:r>
-        <w:t>Tablas</w:t>
-      </w:r>
-    </w:p>
-    <w:p>
-      <w:pPr>
         <w:tabs>
           <w:tab w:val="right" w:pos="8640"/>
         </w:tabs>
         <w:spacing w:after="100" w:line="280" w:lineRule="auto"/>
       </w:pPr>
       <w:r>
-        <w:rPr>
-          <w:sz w:val="22"/>
-          <w:szCs w:val="22"/>
-        </w:rPr>
-        <w:t>Tabla 1. Comparación de herramientas de automatización de bajo costo</w:t>
-      </w:r>
-      <w:r>
-        <w:rPr>
-          <w:sz w:val="22"/>
-          <w:szCs w:val="22"/>
-        </w:rPr>
+        <w:t xml:space="preserve">Figura 8. Panel de documentacion interactiva de la API REST (Swagger UI)</w:t>
+      </w:r>
+      <w:r>
         <w:tab/>
-        <w:t>29</w:t>
+      </w:r>
+      <w:r>
+        <w:t>52</w:t>
       </w:r>
     </w:p>
     <w:p>
@@ -4507,19 +4443,13 @@
         <w:spacing w:after="100" w:line="280" w:lineRule="auto"/>
       </w:pPr>
       <w:r>
-        <w:rPr>
-          <w:sz w:val="22"/>
-          <w:szCs w:val="22"/>
-        </w:rPr>
-        <w:t>Tabla 2. Variables e indicadores de análisis del sistema</w:t>
-      </w:r>
-      <w:r>
-        <w:rPr>
-          <w:sz w:val="22"/>
-          <w:szCs w:val="22"/>
-        </w:rPr>
+        <w:t xml:space="preserve">Figura 9. Dashboard de metricas y analiticas (Streamlit)</w:t>
+      </w:r>
+      <w:r>
         <w:tab/>
-        <w:t>34</w:t>
+      </w:r>
+      <w:r>
+        <w:t>55</w:t>
       </w:r>
     </w:p>
     <w:p>
@@ -4530,19 +4460,13 @@
         <w:spacing w:after="100" w:line="280" w:lineRule="auto"/>
       </w:pPr>
       <w:r>
-        <w:rPr>
-          <w:sz w:val="22"/>
-          <w:szCs w:val="22"/>
-        </w:rPr>
-        <w:t>Tabla 3. Matriz de decisiones de diseño arquitectónico</w:t>
-      </w:r>
-      <w:r>
-        <w:rPr>
-          <w:sz w:val="22"/>
-          <w:szCs w:val="22"/>
-        </w:rPr>
+        <w:t xml:space="preserve">Figura 10. Interaccion del bot en Telegram durante las pruebas funcionales.</w:t>
+      </w:r>
+      <w:r>
         <w:tab/>
-        <w:t>41</w:t>
+      </w:r>
+      <w:r>
+        <w:t>56</w:t>
       </w:r>
     </w:p>
     <w:p>
@@ -4553,19 +4477,13 @@
         <w:spacing w:after="100" w:line="280" w:lineRule="auto"/>
       </w:pPr>
       <w:r>
-        <w:rPr>
-          <w:sz w:val="22"/>
-          <w:szCs w:val="22"/>
-        </w:rPr>
-        <w:t>Tabla 4. Resumen de escenarios de prueba y resultados obtenidos</w:t>
-      </w:r>
-      <w:r>
-        <w:rPr>
-          <w:sz w:val="22"/>
-          <w:szCs w:val="22"/>
-        </w:rPr>
+        <w:t xml:space="preserve">Figura B.1. Flujo de automatizacion del sistema en n8n (canvas del editor)</w:t>
+      </w:r>
+      <w:r>
         <w:tab/>
-        <w:t>55</w:t>
+      </w:r>
+      <w:r>
+        <w:t>84</w:t>
       </w:r>
     </w:p>
     <w:p>
@@ -4576,19 +4494,26 @@
         <w:spacing w:after="100" w:line="280" w:lineRule="auto"/>
       </w:pPr>
       <w:r>
-        <w:rPr>
-          <w:sz w:val="22"/>
-          <w:szCs w:val="22"/>
-        </w:rPr>
-        <w:t>Tabla 5. Mediciones de tiempo de respuesta por tipo de solicitud</w:t>
-      </w:r>
-      <w:r>
-        <w:rPr>
-          <w:sz w:val="22"/>
-          <w:szCs w:val="22"/>
-        </w:rPr>
+        <w:t xml:space="preserve">Figura C.1. Documentacion interactiva de la API REST (Swagger UI)</w:t>
+      </w:r>
+      <w:r>
         <w:tab/>
-        <w:t>56</w:t>
+      </w:r>
+      <w:r>
+        <w:t>85</w:t>
+      </w:r>
+    </w:p>
+    <w:p>
+      <w:pPr>
+        <w:spacing w:after="200"/>
+      </w:pPr>
+    </w:p>
+    <w:p>
+      <w:pPr>
+        <w:pStyle w:val="Normal"/>
+      </w:pPr>
+      <w:r>
+        <w:t>Tablas</w:t>
       </w:r>
     </w:p>
     <w:p>
@@ -4603,7 +4528,7 @@
           <w:sz w:val="22"/>
           <w:szCs w:val="22"/>
         </w:rPr>
-        <w:t>Tabla A.1: Componentes y versiones del sistema</w:t>
+        <w:t>Tabla 1. Comparación de herramientas de automatización de bajo costo</w:t>
       </w:r>
       <w:r>
         <w:rPr>
@@ -4611,7 +4536,7 @@
           <w:szCs w:val="22"/>
         </w:rPr>
         <w:tab/>
-        <w:t>76</w:t>
+        <w:t>29</w:t>
       </w:r>
     </w:p>
     <w:p>
@@ -4626,7 +4551,7 @@
           <w:sz w:val="22"/>
           <w:szCs w:val="22"/>
         </w:rPr>
-        <w:t>Tabla B.1: Nodos del flujo de automatización en n8n</w:t>
+        <w:t>Tabla 2. Variables e indicadores de análisis del sistema</w:t>
       </w:r>
       <w:r>
         <w:rPr>
@@ -4634,7 +4559,7 @@
           <w:szCs w:val="22"/>
         </w:rPr>
         <w:tab/>
-        <w:t>78</w:t>
+        <w:t>34</w:t>
       </w:r>
     </w:p>
     <w:p>
@@ -4649,24 +4574,15 @@
           <w:sz w:val="22"/>
           <w:szCs w:val="22"/>
         </w:rPr>
-        <w:t xml:space="preserve">Tabla B.2: Catálogo de intenciones del Bot </w:t>
-      </w:r>
-      <w:proofErr w:type="spellStart"/>
-      <w:r>
-        <w:rPr>
-          <w:sz w:val="22"/>
-          <w:szCs w:val="22"/>
-        </w:rPr>
-        <w:t>Router</w:t>
-      </w:r>
-      <w:proofErr w:type="spellEnd"/>
+        <w:t>Tabla 3. Matriz de decisiones de diseño arquitectónico</w:t>
+      </w:r>
       <w:r>
         <w:rPr>
           <w:sz w:val="22"/>
           <w:szCs w:val="22"/>
         </w:rPr>
         <w:tab/>
-        <w:t>79</w:t>
+        <w:t>41</w:t>
       </w:r>
     </w:p>
     <w:p>
@@ -4681,23 +4597,7 @@
           <w:sz w:val="22"/>
           <w:szCs w:val="22"/>
         </w:rPr>
-        <w:t xml:space="preserve">Tabla C.1: </w:t>
-      </w:r>
-      <w:proofErr w:type="spellStart"/>
-      <w:r>
-        <w:rPr>
-          <w:sz w:val="22"/>
-          <w:szCs w:val="22"/>
-        </w:rPr>
-        <w:t>Endpoints</w:t>
-      </w:r>
-      <w:proofErr w:type="spellEnd"/>
-      <w:r>
-        <w:rPr>
-          <w:sz w:val="22"/>
-          <w:szCs w:val="22"/>
-        </w:rPr>
-        <w:t xml:space="preserve"> de la API consumidos por el flujo</w:t>
+        <w:t>Tabla 4. Resumen de escenarios de prueba y resultados obtenidos</w:t>
       </w:r>
       <w:r>
         <w:rPr>
@@ -4705,52 +4605,7 @@
           <w:szCs w:val="22"/>
         </w:rPr>
         <w:tab/>
-        <w:t>80</w:t>
-      </w:r>
-    </w:p>
-    <w:p>
-      <w:pPr>
-        <w:spacing w:before="60" w:after="240"/>
-        <w:jc w:val="center"/>
-      </w:pPr>
-      <w:r>
-        <w:rPr>
-          <w:b/>
-          <w:sz w:val="20"/>
-        </w:rPr>
-        <w:t xml:space="preserve">Figura C.1. </w:t>
-      </w:r>
-      <w:proofErr w:type="spellStart"/>
-      <w:r>
-        <w:rPr>
-          <w:b/>
-          <w:sz w:val="20"/>
-        </w:rPr>
-        <w:t>Documentacion</w:t>
-      </w:r>
-      <w:proofErr w:type="spellEnd"/>
-      <w:r>
-        <w:rPr>
-          <w:b/>
-          <w:sz w:val="20"/>
-        </w:rPr>
-        <w:t xml:space="preserve"> interactiva de la API REST (</w:t>
-      </w:r>
-      <w:proofErr w:type="spellStart"/>
-      <w:r>
-        <w:rPr>
-          <w:b/>
-          <w:sz w:val="20"/>
-        </w:rPr>
-        <w:t>Swagger</w:t>
-      </w:r>
-      <w:proofErr w:type="spellEnd"/>
-      <w:r>
-        <w:rPr>
-          <w:b/>
-          <w:sz w:val="20"/>
-        </w:rPr>
-        <w:t xml:space="preserve"> UI)</w:t>
+        <w:t>55</w:t>
       </w:r>
     </w:p>
     <w:p>
@@ -4765,7 +4620,7 @@
           <w:sz w:val="22"/>
           <w:szCs w:val="22"/>
         </w:rPr>
-        <w:t>Tabla D.1: Entidades del modelo de datos</w:t>
+        <w:t>Tabla 5. Mediciones de tiempo de respuesta por tipo de solicitud</w:t>
       </w:r>
       <w:r>
         <w:rPr>
@@ -4773,7 +4628,7 @@
           <w:szCs w:val="22"/>
         </w:rPr>
         <w:tab/>
-        <w:t>81</w:t>
+        <w:t>56</w:t>
       </w:r>
     </w:p>
     <w:p>
@@ -4788,24 +4643,15 @@
           <w:sz w:val="22"/>
           <w:szCs w:val="22"/>
         </w:rPr>
-        <w:t xml:space="preserve">Tabla E.1: Escenarios de prueba del </w:t>
-      </w:r>
-      <w:proofErr w:type="spellStart"/>
-      <w:r>
-        <w:rPr>
-          <w:sz w:val="22"/>
-          <w:szCs w:val="22"/>
-        </w:rPr>
-        <w:t>bot</w:t>
-      </w:r>
-      <w:proofErr w:type="spellEnd"/>
+        <w:t>Tabla A.1: Componentes y versiones del sistema</w:t>
+      </w:r>
       <w:r>
         <w:rPr>
           <w:sz w:val="22"/>
           <w:szCs w:val="22"/>
         </w:rPr>
         <w:tab/>
-        <w:t>83</w:t>
+        <w:t>76</w:t>
       </w:r>
     </w:p>
     <w:p>
@@ -4820,6 +4666,155 @@
           <w:sz w:val="22"/>
           <w:szCs w:val="22"/>
         </w:rPr>
+        <w:t>Tabla B.1: Nodos del flujo de automatización en n8n</w:t>
+      </w:r>
+      <w:r>
+        <w:rPr>
+          <w:sz w:val="22"/>
+          <w:szCs w:val="22"/>
+        </w:rPr>
+        <w:tab/>
+        <w:t>78</w:t>
+      </w:r>
+    </w:p>
+    <w:p>
+      <w:pPr>
+        <w:tabs>
+          <w:tab w:val="right" w:pos="8640"/>
+        </w:tabs>
+        <w:spacing w:after="100" w:line="280" w:lineRule="auto"/>
+      </w:pPr>
+      <w:r>
+        <w:rPr>
+          <w:sz w:val="22"/>
+          <w:szCs w:val="22"/>
+        </w:rPr>
+        <w:t xml:space="preserve">Tabla B.2: Catálogo de intenciones del Bot </w:t>
+      </w:r>
+      <w:proofErr w:type="spellStart"/>
+      <w:r>
+        <w:rPr>
+          <w:sz w:val="22"/>
+          <w:szCs w:val="22"/>
+        </w:rPr>
+        <w:t>Router</w:t>
+      </w:r>
+      <w:proofErr w:type="spellEnd"/>
+      <w:r>
+        <w:rPr>
+          <w:sz w:val="22"/>
+          <w:szCs w:val="22"/>
+        </w:rPr>
+        <w:tab/>
+        <w:t>79</w:t>
+      </w:r>
+    </w:p>
+    <w:p>
+      <w:pPr>
+        <w:tabs>
+          <w:tab w:val="right" w:pos="8640"/>
+        </w:tabs>
+        <w:spacing w:after="100" w:line="280" w:lineRule="auto"/>
+      </w:pPr>
+      <w:r>
+        <w:rPr>
+          <w:sz w:val="22"/>
+          <w:szCs w:val="22"/>
+        </w:rPr>
+        <w:t xml:space="preserve">Tabla C.1: </w:t>
+      </w:r>
+      <w:proofErr w:type="spellStart"/>
+      <w:r>
+        <w:rPr>
+          <w:sz w:val="22"/>
+          <w:szCs w:val="22"/>
+        </w:rPr>
+        <w:t>Endpoints</w:t>
+      </w:r>
+      <w:proofErr w:type="spellEnd"/>
+      <w:r>
+        <w:rPr>
+          <w:sz w:val="22"/>
+          <w:szCs w:val="22"/>
+        </w:rPr>
+        <w:t xml:space="preserve"> de la API consumidos por el flujo</w:t>
+      </w:r>
+      <w:r>
+        <w:rPr>
+          <w:sz w:val="22"/>
+          <w:szCs w:val="22"/>
+        </w:rPr>
+        <w:tab/>
+        <w:t>80</w:t>
+      </w:r>
+    </w:p>
+    <w:p>
+      <w:pPr>
+        <w:tabs>
+          <w:tab w:val="right" w:pos="8640"/>
+        </w:tabs>
+        <w:spacing w:after="100" w:line="280" w:lineRule="auto"/>
+      </w:pPr>
+      <w:r>
+        <w:rPr>
+          <w:sz w:val="22"/>
+          <w:szCs w:val="22"/>
+        </w:rPr>
+        <w:t>Tabla D.1: Entidades del modelo de datos</w:t>
+      </w:r>
+      <w:r>
+        <w:rPr>
+          <w:sz w:val="22"/>
+          <w:szCs w:val="22"/>
+        </w:rPr>
+        <w:tab/>
+        <w:t>81</w:t>
+      </w:r>
+    </w:p>
+    <w:p>
+      <w:pPr>
+        <w:tabs>
+          <w:tab w:val="right" w:pos="8640"/>
+        </w:tabs>
+        <w:spacing w:after="100" w:line="280" w:lineRule="auto"/>
+      </w:pPr>
+      <w:r>
+        <w:rPr>
+          <w:sz w:val="22"/>
+          <w:szCs w:val="22"/>
+        </w:rPr>
+        <w:t xml:space="preserve">Tabla E.1: Escenarios de prueba del </w:t>
+      </w:r>
+      <w:proofErr w:type="spellStart"/>
+      <w:r>
+        <w:rPr>
+          <w:sz w:val="22"/>
+          <w:szCs w:val="22"/>
+        </w:rPr>
+        <w:t>bot</w:t>
+      </w:r>
+      <w:proofErr w:type="spellEnd"/>
+      <w:r>
+        <w:rPr>
+          <w:sz w:val="22"/>
+          <w:szCs w:val="22"/>
+        </w:rPr>
+        <w:tab/>
+        <w:t>83</w:t>
+      </w:r>
+    </w:p>
+    <w:p>
+      <w:pPr>
+        <w:tabs>
+          <w:tab w:val="right" w:pos="8640"/>
+        </w:tabs>
+        <w:spacing w:after="100" w:line="280" w:lineRule="auto"/>
+      </w:pPr>
+      <w:r>
+        <w:rPr>
+          <w:sz w:val="22"/>
+          <w:szCs w:val="22"/>
+        </w:rPr>
         <w:t>Tabla 6. Evaluación de precisión de la interpretación por intención</w:t>
       </w:r>
       <w:r>
@@ -4829,6 +4824,23 @@
         </w:rPr>
         <w:tab/>
         <w:t>57</w:t>
+      </w:r>
+    </w:p>
+    <w:p>
+      <w:pPr>
+        <w:tabs>
+          <w:tab w:val="right" w:pos="8640"/>
+        </w:tabs>
+        <w:spacing w:after="100" w:line="280" w:lineRule="auto"/>
+      </w:pPr>
+      <w:r>
+        <w:t xml:space="preserve">Tabla 7. Análisis de casos límite del Bot Router</w:t>
+      </w:r>
+      <w:r>
+        <w:tab/>
+      </w:r>
+      <w:r>
+        <w:t>62</w:t>
       </w:r>
     </w:p>
     <w:p>

</xml_diff>